<commit_message>
feat: renomeia seção de certificados para formação e capacitação
</commit_message>
<xml_diff>
--- a/public/pdf/Curriculo_Joao_Gabriel.docx
+++ b/public/pdf/Curriculo_Joao_Gabriel.docx
@@ -65,13 +65,116 @@
       <w:pPr>
         <w:spacing w:after="0"/>
       </w:pPr>
+      <w:hyperlink r:id="rId6" w:history="1">
+        <w:r>
+          <w:rPr>
+            <w:rStyle w:val="Hyperlink"/>
+            <w:sz w:val="19"/>
+          </w:rPr>
+          <w:t>joaogab</w:t>
+        </w:r>
+        <w:r>
+          <w:rPr>
+            <w:rStyle w:val="Hyperlink"/>
+            <w:sz w:val="19"/>
+          </w:rPr>
+          <w:t>g</w:t>
+        </w:r>
+        <w:r>
+          <w:rPr>
+            <w:rStyle w:val="Hyperlink"/>
+            <w:sz w:val="19"/>
+          </w:rPr>
+          <w:t>r.com</w:t>
+        </w:r>
+      </w:hyperlink>
       <w:r>
         <w:rPr>
           <w:color w:val="555555"/>
           <w:sz w:val="19"/>
         </w:rPr>
-        <w:t>joaogabgr.com  ·  github.com/joaogabgr  ·  linkedin.com/in/joaogabgr</w:t>
+        <w:t xml:space="preserve">  ·  </w:t>
       </w:r>
+      <w:hyperlink r:id="rId7" w:history="1">
+        <w:r>
+          <w:rPr>
+            <w:rStyle w:val="Hyperlink"/>
+            <w:sz w:val="19"/>
+          </w:rPr>
+          <w:t>github.com</w:t>
+        </w:r>
+        <w:r>
+          <w:rPr>
+            <w:rStyle w:val="Hyperlink"/>
+            <w:sz w:val="19"/>
+          </w:rPr>
+          <w:t>/</w:t>
+        </w:r>
+        <w:proofErr w:type="spellStart"/>
+        <w:r>
+          <w:rPr>
+            <w:rStyle w:val="Hyperlink"/>
+            <w:sz w:val="19"/>
+          </w:rPr>
+          <w:t>joaogabg</w:t>
+        </w:r>
+      </w:hyperlink>
+      <w:proofErr w:type="gramStart"/>
+      <w:r>
+        <w:rPr>
+          <w:color w:val="555555"/>
+          <w:sz w:val="19"/>
+        </w:rPr>
+        <w:t>r</w:t>
+      </w:r>
+      <w:proofErr w:type="spellEnd"/>
+      <w:r>
+        <w:rPr>
+          <w:color w:val="555555"/>
+          <w:sz w:val="19"/>
+        </w:rPr>
+        <w:t xml:space="preserve">  ·</w:t>
+      </w:r>
+      <w:proofErr w:type="gramEnd"/>
+      <w:r>
+        <w:rPr>
+          <w:color w:val="555555"/>
+          <w:sz w:val="19"/>
+        </w:rPr>
+        <w:t xml:space="preserve">  </w:t>
+      </w:r>
+      <w:hyperlink r:id="rId8" w:history="1">
+        <w:r>
+          <w:rPr>
+            <w:rStyle w:val="Hyperlink"/>
+            <w:sz w:val="19"/>
+          </w:rPr>
+          <w:t>linkedin.co</w:t>
+        </w:r>
+        <w:r>
+          <w:rPr>
+            <w:rStyle w:val="Hyperlink"/>
+            <w:sz w:val="19"/>
+          </w:rPr>
+          <w:t>m</w:t>
+        </w:r>
+        <w:r>
+          <w:rPr>
+            <w:rStyle w:val="Hyperlink"/>
+            <w:sz w:val="19"/>
+          </w:rPr>
+          <w:t>/in/</w:t>
+        </w:r>
+        <w:proofErr w:type="spellStart"/>
+        <w:r>
+          <w:rPr>
+            <w:rStyle w:val="Hyperlink"/>
+            <w:sz w:val="19"/>
+          </w:rPr>
+          <w:t>joaogabgr</w:t>
+        </w:r>
+        <w:proofErr w:type="spellEnd"/>
+      </w:hyperlink>
     </w:p>
     <w:p>
       <w:pPr>
@@ -93,13 +196,55 @@
         <w:spacing w:after="40"/>
       </w:pPr>
       <w:r>
-        <w:t xml:space="preserve">Fullstack Developer que </w:t>
+        <w:t xml:space="preserve">Fullstack Developer que entrega de ponta a ponta: do refinamento de backlog ao deploy em produção. Atuo em sistemas que lidam com dinheiro real, usuários reais e orçamentos </w:t>
       </w:r>
+      <w:proofErr w:type="spellStart"/>
       <w:r>
-        <w:t xml:space="preserve">entrega de ponta a ponta: do refinamento de backlog ao deploy em produção. Atuo em sistemas que lidam com dinheiro real, usuários reais e orçamentos apertados de latência — mercado financeiro, IA aplicada, plataformas event-driven. Founder da Motus Sports </w:t>
+        <w:t>apertados</w:t>
       </w:r>
+      <w:proofErr w:type="spellEnd"/>
       <w:r>
-        <w:t>(inteligência esportiva para clubes profissionais) e da Speakyroo (plataforma de prática de inglês). Construo sistemas que rodam em produção, sustentam usuários reais e respondem a métricas, não a demos.</w:t>
+        <w:t xml:space="preserve"> de </w:t>
+      </w:r>
+      <w:proofErr w:type="spellStart"/>
+      <w:r>
+        <w:t>latência</w:t>
+      </w:r>
+      <w:proofErr w:type="spellEnd"/>
+      <w:r>
+        <w:t xml:space="preserve"> mercado </w:t>
+      </w:r>
+      <w:proofErr w:type="spellStart"/>
+      <w:r>
+        <w:t>financeiro</w:t>
+      </w:r>
+      <w:proofErr w:type="spellEnd"/>
+      <w:r>
+        <w:t xml:space="preserve">, IA </w:t>
+      </w:r>
+      <w:proofErr w:type="spellStart"/>
+      <w:r>
+        <w:t>aplicada</w:t>
+      </w:r>
+      <w:proofErr w:type="spellEnd"/>
+      <w:r>
+        <w:t xml:space="preserve">, plataformas event-driven. Founder da Motus Sports (inteligência esportiva para clubes profissionais) Construo sistemas que rodam em produção, sustentam usuários reais e </w:t>
+      </w:r>
+      <w:proofErr w:type="spellStart"/>
+      <w:r>
+        <w:t>respondem</w:t>
+      </w:r>
+      <w:proofErr w:type="spellEnd"/>
+      <w:r>
+        <w:t xml:space="preserve"> a </w:t>
+      </w:r>
+      <w:proofErr w:type="spellStart"/>
+      <w:r>
+        <w:t>métricas</w:t>
+      </w:r>
+      <w:proofErr w:type="spellEnd"/>
+      <w:r>
+        <w:t>.</w:t>
       </w:r>
     </w:p>
     <w:p>
@@ -126,14 +271,7 @@
           <w:b/>
           <w:sz w:val="22"/>
         </w:rPr>
-        <w:t>Genesis Data Culture  —  Fu</w:t>
-      </w:r>
-      <w:r>
-        <w:rPr>
-          <w:b/>
-          <w:sz w:val="22"/>
-        </w:rPr>
-        <w:t>llstack Developer · Plataforma BlackBots</w:t>
+        <w:t>Genesis Data Culture  —  Fullstack Developer · Plataforma BlackBots</w:t>
       </w:r>
       <w:r>
         <w:rPr>
@@ -152,13 +290,7 @@
         <w:rPr>
           <w:sz w:val="20"/>
         </w:rPr>
-        <w:t>BlackBots é uma plataforma de mercado financeiro que unifica operação em renda variável (B3, via parceiras XP e Cedro) e cripto (OKX) em uma única interface. Atuo de ponta a po</w:t>
-      </w:r>
-      <w:r>
-        <w:rPr>
-          <w:sz w:val="20"/>
-        </w:rPr>
-        <w:t>nta nos módulos críticos do produto.</w:t>
+        <w:t>BlackBots é uma plataforma de mercado financeiro que unifica operação em renda variável (B3, via parceiras XP e Cedro) e cripto (OKX) em uma única interface. Atuo de ponta a ponta nos módulos críticos do produto.</w:t>
       </w:r>
     </w:p>
     <w:p>
@@ -197,13 +329,7 @@
         <w:rPr>
           <w:sz w:val="20"/>
         </w:rPr>
-        <w:t>Gráfico de mercado em tempo r</w:t>
-      </w:r>
-      <w:r>
-        <w:rPr>
-          <w:sz w:val="20"/>
-        </w:rPr>
-        <w:t>eal no estilo TradingView com ECharts + WebSockets (cotação e estado da conta).</w:t>
+        <w:t>Gráfico de mercado em tempo real no estilo TradingView com ECharts + WebSockets (cotação e estado da conta).</w:t>
       </w:r>
     </w:p>
     <w:p>
@@ -229,13 +355,7 @@
         <w:rPr>
           <w:sz w:val="20"/>
         </w:rPr>
-        <w:t>Camada de pagamentos integrando Stripe, AbacatePay e Eduzz (checkout, assinaturas e</w:t>
-      </w:r>
-      <w:r>
-        <w:rPr>
-          <w:sz w:val="20"/>
-        </w:rPr>
-        <w:t xml:space="preserve"> produtos digitais).</w:t>
+        <w:t>Camada de pagamentos integrando Stripe, AbacatePay e Eduzz (checkout, assinaturas e produtos digitais).</w:t>
       </w:r>
     </w:p>
     <w:p>
@@ -274,13 +394,7 @@
         <w:rPr>
           <w:sz w:val="20"/>
         </w:rPr>
-        <w:t>Pipeline de deploy automatizado em Cloud Ru</w:t>
-      </w:r>
-      <w:r>
-        <w:rPr>
-          <w:sz w:val="20"/>
-        </w:rPr>
-        <w:t>n (backend), AWS EC2 (serviços externos) e Firebase.</w:t>
+        <w:t>Pipeline de deploy automatizado em Cloud Run (backend), AWS EC2 (serviços externos) e Firebase.</w:t>
       </w:r>
     </w:p>
     <w:p>
@@ -345,13 +459,7 @@
         <w:rPr>
           <w:sz w:val="20"/>
         </w:rPr>
-        <w:t>Plataforma de inteligência esportiva para clubes profissionais de futebol. Integra dados de auto-relato dos atletas, carga de treino, sono, dor e histórico clínico em um único ambiente, e usa IA preditiva para gerar alertas de risco de lesão com até 72h de</w:t>
-      </w:r>
-      <w:r>
-        <w:rPr>
-          <w:sz w:val="20"/>
-        </w:rPr>
-        <w:t xml:space="preserve"> antecedência da partida.</w:t>
+        <w:t>Plataforma de inteligência esportiva para clubes profissionais de futebol. Integra dados de auto-relato dos atletas, carga de treino, sono, dor e histórico clínico em um único ambiente, e usa IA preditiva para gerar alertas de risco de lesão com até 72h de antecedência da partida.</w:t>
       </w:r>
     </w:p>
     <w:p>
@@ -377,13 +485,7 @@
         <w:rPr>
           <w:sz w:val="20"/>
         </w:rPr>
-        <w:t>Condução de visão de produto, arquitetura técnica, go-to-mark</w:t>
-      </w:r>
-      <w:r>
-        <w:rPr>
-          <w:sz w:val="20"/>
-        </w:rPr>
-        <w:t>et B2B e narrativa institucional.</w:t>
+        <w:t>Condução de visão de produto, arquitetura técnica, go-to-market B2B e narrativa institucional.</w:t>
       </w:r>
     </w:p>
     <w:p>
@@ -401,130 +503,89 @@
     </w:p>
     <w:p>
       <w:pPr>
-        <w:spacing w:before="80" w:after="0"/>
-      </w:pPr>
-      <w:r>
+        <w:spacing w:after="0"/>
         <w:rPr>
           <w:b/>
           <w:sz w:val="22"/>
         </w:rPr>
-        <w:t>Speakyroo  —  Founder &amp; Fullstack Developer</w:t>
-      </w:r>
-      <w:r>
-        <w:rPr>
-          <w:i/>
-          <w:color w:val="555555"/>
-          <w:sz w:val="20"/>
-        </w:rPr>
-        <w:t xml:space="preserve">   ·   2024 — Atual</w:t>
-      </w:r>
-    </w:p>
-    <w:p>
-      <w:pPr>
-        <w:spacing w:after="40"/>
       </w:pPr>
-      <w:r>
-        <w:rPr>
-          <w:sz w:val="20"/>
-        </w:rPr>
-        <w:t xml:space="preserve">Plataforma web full-stack de prática ativa de inglês para </w:t>
-      </w:r>
-      <w:r>
-        <w:rPr>
-          <w:sz w:val="20"/>
-        </w:rPr>
-        <w:t>brasileiros, com 6 módulos integrados (Reading, Listening, Vocabulary, Grammar, Interactive Conversations, Premium Immersions). Modelo freemium com paywall via Stripe.</w:t>
-      </w:r>
-    </w:p>
-    <w:p>
-      <w:pPr>
-        <w:pStyle w:val="Commarcadores"/>
-        <w:spacing w:after="20"/>
-        <w:ind w:left="283"/>
-      </w:pPr>
-      <w:r>
-        <w:rPr>
-          <w:sz w:val="20"/>
-        </w:rPr>
-        <w:t>Backend Node.js/Express com 16 modelos Mongoose, compound unique indexes e progresso gra</w:t>
-      </w:r>
-      <w:r>
-        <w:rPr>
-          <w:sz w:val="20"/>
-        </w:rPr>
-        <w:t>nular por usuário.</w:t>
-      </w:r>
-    </w:p>
-    <w:p>
-      <w:pPr>
-        <w:pStyle w:val="Commarcadores"/>
-        <w:spacing w:after="20"/>
-        <w:ind w:left="283"/>
-      </w:pPr>
-      <w:r>
-        <w:rPr>
-          <w:sz w:val="20"/>
-        </w:rPr>
-        <w:t>Sistema de repetição espaçada para vocabulário/gramática com priorização (due &gt; unseen &gt; random).</w:t>
-      </w:r>
-    </w:p>
-    <w:p>
-      <w:pPr>
-        <w:pStyle w:val="Commarcadores"/>
-        <w:spacing w:after="20"/>
-        <w:ind w:left="283"/>
-      </w:pPr>
-      <w:r>
-        <w:rPr>
-          <w:sz w:val="20"/>
-        </w:rPr>
-        <w:t>Premium Immersions em 8 etapas sequenciais com XP, badges e retomada inteligente do estágio do usuário.</w:t>
-      </w:r>
-    </w:p>
-    <w:p>
-      <w:pPr>
-        <w:pStyle w:val="Commarcadores"/>
-        <w:spacing w:after="20"/>
-        <w:ind w:left="283"/>
-      </w:pPr>
-      <w:r>
-        <w:rPr>
-          <w:sz w:val="20"/>
-        </w:rPr>
-        <w:t>Stack: React 19 · TypeScript · Vite</w:t>
-      </w:r>
-      <w:r>
-        <w:rPr>
-          <w:sz w:val="20"/>
-        </w:rPr>
-        <w:t xml:space="preserve"> · Node.js · MongoDB · Firebase Auth · Stripe · Docker.</w:t>
-      </w:r>
     </w:p>
     <w:p>
       <w:pPr>
         <w:spacing w:after="0"/>
       </w:pPr>
+      <w:proofErr w:type="spellStart"/>
       <w:r>
         <w:rPr>
           <w:i/>
           <w:color w:val="555555"/>
           <w:sz w:val="19"/>
         </w:rPr>
-        <w:t>Complementa o portfólio: 6 projetos acadêmicos em parceria institucional (Exército Brasileiro, Tecsus, FAPG e outros) — disponíveis em joaogabgr.com.</w:t>
+        <w:t>Complementa</w:t>
       </w:r>
-    </w:p>
-    <w:p>
-      <w:pPr>
-        <w:pBdr>
-          <w:bottom w:val="single" w:sz="6" w:space="0" w:color="1F4E9F"/>
-        </w:pBdr>
-        <w:spacing w:before="160" w:after="40"/>
+      <w:proofErr w:type="spellEnd"/>
+      <w:r>
         <w:rPr>
-          <w:b/>
-          <w:color w:val="1F4E9F"/>
-          <w:sz w:val="26"/>
+          <w:i/>
+          <w:color w:val="555555"/>
+          <w:sz w:val="19"/>
         </w:rPr>
-      </w:pPr>
+        <w:t xml:space="preserve"> o </w:t>
+      </w:r>
+      <w:proofErr w:type="spellStart"/>
+      <w:r>
+        <w:rPr>
+          <w:i/>
+          <w:color w:val="555555"/>
+          <w:sz w:val="19"/>
+        </w:rPr>
+        <w:t>portfólio</w:t>
+      </w:r>
+      <w:proofErr w:type="spellEnd"/>
+      <w:r>
+        <w:rPr>
+          <w:i/>
+          <w:color w:val="555555"/>
+          <w:sz w:val="19"/>
+        </w:rPr>
+        <w:t xml:space="preserve">: 6 projetos acadêmicos em parceria institucional (Exército Brasileiro, Tecsus, FAPG e outros) — </w:t>
+      </w:r>
+      <w:proofErr w:type="spellStart"/>
+      <w:r>
+        <w:rPr>
+          <w:i/>
+          <w:color w:val="555555"/>
+          <w:sz w:val="19"/>
+        </w:rPr>
+        <w:t>disponíveis</w:t>
+      </w:r>
+      <w:proofErr w:type="spellEnd"/>
+      <w:r>
+        <w:rPr>
+          <w:i/>
+          <w:color w:val="555555"/>
+          <w:sz w:val="19"/>
+        </w:rPr>
+        <w:t xml:space="preserve"> </w:t>
+      </w:r>
+      <w:proofErr w:type="spellStart"/>
+      <w:r>
+        <w:rPr>
+          <w:i/>
+          <w:color w:val="555555"/>
+          <w:sz w:val="19"/>
+        </w:rPr>
+        <w:t>em</w:t>
+      </w:r>
+      <w:proofErr w:type="spellEnd"/>
+      <w:r>
+        <w:rPr>
+          <w:i/>
+          <w:color w:val="555555"/>
+          <w:sz w:val="19"/>
+        </w:rPr>
+        <w:t xml:space="preserve"> joaogabgr.com.</w:t>
+      </w:r>
     </w:p>
     <w:p>
       <w:pPr>
@@ -538,7 +599,6 @@
           <w:b/>
           <w:sz w:val="26"/>
         </w:rPr>
-        <w:lastRenderedPageBreak/>
         <w:t>COMPETÊNCIAS TÉCNICAS</w:t>
       </w:r>
     </w:p>
@@ -550,13 +610,7 @@
         <w:rPr>
           <w:sz w:val="20"/>
         </w:rPr>
-        <w:t>Linguagens:  TypeScript · Ja</w:t>
-      </w:r>
-      <w:r>
-        <w:rPr>
-          <w:sz w:val="20"/>
-        </w:rPr>
-        <w:t>vaScript · Python · Java</w:t>
+        <w:t xml:space="preserve">Linguagens:  TypeScript · JavaScript · Python </w:t>
       </w:r>
     </w:p>
     <w:p>
@@ -600,13 +654,7 @@
         <w:rPr>
           <w:sz w:val="20"/>
         </w:rPr>
-        <w:t xml:space="preserve">Infra &amp; DevOps:  AWS (EC2, Lambda) · </w:t>
-      </w:r>
-      <w:r>
-        <w:rPr>
-          <w:sz w:val="20"/>
-        </w:rPr>
-        <w:t>Cloud Run · Docker · Firebase · CI/CD · Git/GitHub</w:t>
+        <w:t>Infra &amp; DevOps:  AWS (EC2, Lambda) · Cloud Run · Docker · Firebase · CI/CD · Git/GitHub</w:t>
       </w:r>
     </w:p>
     <w:p>
@@ -643,6 +691,7 @@
           <w:b/>
           <w:sz w:val="26"/>
         </w:rPr>
+        <w:lastRenderedPageBreak/>
         <w:t>FORMAÇÃO ACADÊMICA</w:t>
       </w:r>
     </w:p>
@@ -655,14 +704,7 @@
           <w:b/>
           <w:sz w:val="22"/>
         </w:rPr>
-        <w:t>Desenvolvimento de Software Multiplataforma</w:t>
-      </w:r>
-      <w:r>
-        <w:rPr>
-          <w:b/>
-          <w:sz w:val="22"/>
-        </w:rPr>
-        <w:t xml:space="preserve">  —  FATEC São José dos Campos</w:t>
+        <w:t>Desenvolvimento de Software Multiplataforma  —  FATEC São José dos Campos</w:t>
       </w:r>
       <w:r>
         <w:rPr>
@@ -744,14 +786,7 @@
           <w:b/>
           <w:sz w:val="26"/>
         </w:rPr>
-        <w:t>RECONHECIMENTO</w:t>
-      </w:r>
-      <w:r>
-        <w:rPr>
-          <w:b/>
-          <w:sz w:val="26"/>
-        </w:rPr>
-        <w:t>S</w:t>
+        <w:t>RECONHECIMENTOS</w:t>
       </w:r>
     </w:p>
     <w:p>
@@ -1308,11 +1343,6 @@
     <w:lsdException w:name="Book Title" w:uiPriority="33" w:qFormat="1"/>
     <w:lsdException w:name="Bibliography" w:semiHidden="1" w:uiPriority="37" w:unhideWhenUsed="1"/>
     <w:lsdException w:name="TOC Heading" w:semiHidden="1" w:uiPriority="39" w:unhideWhenUsed="1" w:qFormat="1"/>
-    <w:lsdException w:name="Plain Table 5" w:semiHidden="1" w:unhideWhenUsed="1"/>
-    <w:lsdException w:name="Grid Table Light" w:semiHidden="1" w:unhideWhenUsed="1"/>
-    <w:lsdException w:name="Grid Table 1 Light" w:semiHidden="1" w:unhideWhenUsed="1"/>
-    <w:lsdException w:name="Grid Table 2" w:semiHidden="1" w:unhideWhenUsed="1"/>
-    <w:lsdException w:name="Grid Table 3" w:semiHidden="1" w:unhideWhenUsed="1"/>
     <w:lsdException w:name="Grid Table 4" w:uiPriority="49"/>
     <w:lsdException w:name="Grid Table 5 Dark" w:uiPriority="50"/>
     <w:lsdException w:name="Grid Table 6 Colorful" w:uiPriority="51"/>
@@ -12411,6 +12441,41 @@
         <w:shd w:val="clear" w:color="auto" w:fill="FBCAA2" w:themeFill="accent6" w:themeFillTint="7F"/>
       </w:tcPr>
     </w:tblStylePr>
+  </w:style>
+  <w:style w:type="character" w:styleId="Hyperlink">
+    <w:name w:val="Hyperlink"/>
+    <w:basedOn w:val="Fontepargpadro"/>
+    <w:uiPriority w:val="99"/>
+    <w:unhideWhenUsed/>
+    <w:rsid w:val="00596412"/>
+    <w:rPr>
+      <w:color w:val="0000FF" w:themeColor="hyperlink"/>
+      <w:u w:val="single"/>
+    </w:rPr>
+  </w:style>
+  <w:style w:type="character" w:styleId="MenoPendente">
+    <w:name w:val="Unresolved Mention"/>
+    <w:basedOn w:val="Fontepargpadro"/>
+    <w:uiPriority w:val="99"/>
+    <w:semiHidden/>
+    <w:unhideWhenUsed/>
+    <w:rsid w:val="00596412"/>
+    <w:rPr>
+      <w:color w:val="605E5C"/>
+      <w:shd w:val="clear" w:color="auto" w:fill="E1DFDD"/>
+    </w:rPr>
+  </w:style>
+  <w:style w:type="character" w:styleId="HiperlinkVisitado">
+    <w:name w:val="FollowedHyperlink"/>
+    <w:basedOn w:val="Fontepargpadro"/>
+    <w:uiPriority w:val="99"/>
+    <w:semiHidden/>
+    <w:unhideWhenUsed/>
+    <w:rsid w:val="00596412"/>
+    <w:rPr>
+      <w:color w:val="800080" w:themeColor="followedHyperlink"/>
+      <w:u w:val="single"/>
+    </w:rPr>
   </w:style>
 </w:styles>
 </file>

</xml_diff>